<commit_message>
Finalize report, screenshots, and GitHub Actions workflow
</commit_message>
<xml_diff>
--- a/reports/AI-Powered Food Waste Prediction and Smart Inventory Optimization for Retail.docx
+++ b/reports/AI-Powered Food Waste Prediction and Smart Inventory Optimization for Retail.docx
@@ -4360,9 +4360,81 @@
         </w:rPr>
         <w:t>A GitHub Actions workflow was added to support triggered pipeline validation and automated source-code checks during repository updates.</w:t>
       </w:r>
+    </w:p>
+    <w:p>
+      <w:pPr>
+        <w:jc w:val="both"/>
+        <w:rPr>
+          <w:rFonts w:ascii="Times New Roman" w:hAnsi="Times New Roman" w:cs="Times New Roman"/>
+          <w:sz w:val="24"/>
+          <w:szCs w:val="24"/>
+        </w:rPr>
+      </w:pPr>
+      <w:r>
+        <w:rPr>
+          <w:rFonts w:ascii="Times New Roman" w:hAnsi="Times New Roman" w:cs="Times New Roman"/>
+          <w:sz w:val="24"/>
+          <w:szCs w:val="24"/>
+        </w:rPr>
+        <w:drawing>
+          <wp:inline distT="0" distB="0" distL="0" distR="0" wp14:anchorId="361D666C" wp14:editId="502D0B74">
+            <wp:extent cx="5486400" cy="2991485"/>
+            <wp:effectExtent l="0" t="0" r="0" b="0"/>
+            <wp:docPr id="7" name="Picture 7"/>
+            <wp:cNvGraphicFramePr>
+              <a:graphicFrameLocks xmlns:a="http://schemas.openxmlformats.org/drawingml/2006/main" noChangeAspect="1"/>
+            </wp:cNvGraphicFramePr>
+            <a:graphic xmlns:a="http://schemas.openxmlformats.org/drawingml/2006/main">
+              <a:graphicData uri="http://schemas.openxmlformats.org/drawingml/2006/picture">
+                <pic:pic xmlns:pic="http://schemas.openxmlformats.org/drawingml/2006/picture">
+                  <pic:nvPicPr>
+                    <pic:cNvPr id="1" name=""/>
+                    <pic:cNvPicPr/>
+                  </pic:nvPicPr>
+                  <pic:blipFill>
+                    <a:blip r:embed="rId12"/>
+                    <a:stretch>
+                      <a:fillRect/>
+                    </a:stretch>
+                  </pic:blipFill>
+                  <pic:spPr>
+                    <a:xfrm>
+                      <a:off x="0" y="0"/>
+                      <a:ext cx="5486400" cy="2991485"/>
+                    </a:xfrm>
+                    <a:prstGeom prst="rect">
+                      <a:avLst/>
+                    </a:prstGeom>
+                  </pic:spPr>
+                </pic:pic>
+              </a:graphicData>
+            </a:graphic>
+          </wp:inline>
+        </w:drawing>
+      </w:r>
+    </w:p>
+    <w:p>
+      <w:pPr>
+        <w:jc w:val="center"/>
+        <w:rPr>
+          <w:rFonts w:ascii="Times New Roman" w:hAnsi="Times New Roman" w:cs="Times New Roman"/>
+          <w:b/>
+          <w:sz w:val="24"/>
+          <w:szCs w:val="24"/>
+        </w:rPr>
+      </w:pPr>
       <w:bookmarkStart w:id="0" w:name="_GoBack"/>
-      <w:bookmarkEnd w:id="0"/>
+      <w:r>
+        <w:rPr>
+          <w:rFonts w:ascii="Times New Roman" w:hAnsi="Times New Roman" w:cs="Times New Roman"/>
+          <w:b/>
+          <w:sz w:val="24"/>
+          <w:szCs w:val="24"/>
+        </w:rPr>
+        <w:t>Figure 7: GitHub Actions workflow execution showing successful automated pipeline validation.</w:t>
+      </w:r>
     </w:p>
+    <w:bookmarkEnd w:id="0"/>
     <w:p>
       <w:pPr>
         <w:pStyle w:val="Heading2"/>
@@ -4486,6 +4558,7 @@
           <w:sz w:val="24"/>
           <w:szCs w:val="24"/>
         </w:rPr>
+        <w:lastRenderedPageBreak/>
         <w:br/>
       </w:r>
       <w:r>
@@ -16523,7 +16596,7 @@
 </file>
 
 <file path=customXml/itemProps1.xml><?xml version="1.0" encoding="utf-8"?>
-<ds:datastoreItem xmlns:ds="http://schemas.openxmlformats.org/officeDocument/2006/customXml" ds:itemID="{282ED24A-C8A9-4454-B64C-91378A4D8034}">
+<ds:datastoreItem xmlns:ds="http://schemas.openxmlformats.org/officeDocument/2006/customXml" ds:itemID="{321F757B-959F-451D-998B-7F289626D416}">
   <ds:schemaRefs>
     <ds:schemaRef ds:uri="http://schemas.openxmlformats.org/officeDocument/2006/bibliography"/>
   </ds:schemaRefs>

</xml_diff>